<commit_message>
docs: refresh 20 July team update (deploy 4 shell localization + QA validation)
Co-Authored-By: Claude Fable 5 <noreply@anthropic.com>
</commit_message>
<xml_diff>
--- a/docs/Platform_Update_Proximate_20_July_2026.docx
+++ b/docs/Platform_Update_Proximate_20_July_2026.docx
@@ -56,7 +56,7 @@
           <w:sz w:val="22"/>
           <w:szCs w:val="22"/>
         </w:rPr>
-        <w:t xml:space="preserve">Three production deployments went out today. None of them changes anything you can see on an English screen — every English label, button, and flow is byte-for-byte identical, so the UAT pack and the QA scripts are unaffected. What changed underneath: the console now speaks all six languages properly, and the remaining items from the QA team’s 20 July feedback are closed. The system is healthy and the UAT continues on the same screens.</w:t>
+        <w:t xml:space="preserve">Four production deployments went out today. None of them changes anything you can see on an English screen — every English label, button, and flow is byte-for-byte identical, so the UAT pack and the QA scripts are unaffected. What changed underneath: the console now speaks all six languages properly — content AND chrome — and the remaining items from the QA team’s 20 July feedback are closed. The QA team independently validated the release against live production the same day (9.6/10: full regression pass, 25/25 live money-flow cases, payment-confirmation proof on a real upload, clean Arabic browser pass). The system is healthy and the UAT continues on the same screens.</w:t>
       </w:r>
     </w:p>
     <w:p>
@@ -208,6 +208,31 @@
         <w:pStyle w:val="Heading2"/>
       </w:pPr>
       <w:r>
+        <w:t xml:space="preserve">4. The app frame now switches language too</w:t>
+      </w:r>
+    </w:p>
+    <w:p>
+      <w:pPr>
+        <w:spacing w:after="120"/>
+      </w:pPr>
+      <w:r>
+        <w:rPr>
+          <w:b w:val="false"/>
+          <w:bCs w:val="false"/>
+          <w:i w:val="false"/>
+          <w:iCs w:val="false"/>
+          <w:color w:val="222222"/>
+          <w:sz w:val="22"/>
+          <w:szCs w:val="22"/>
+        </w:rPr>
+        <w:t xml:space="preserve">The QA team’s one caveat in their validation: page content was translated, but the frame around it — the sidebar menu ("Dashboard", "All disbursements", "Audit chain"), the Workspace/Operations/Governance section headers, the quick-search palette, and the header Search box — still showed English in non-English sessions. That gap is now closed: the entire shell follows the user’s language in all six locales. An Arabic-speaking OB member now sees a fully Arabic screen edge to edge, and the same holds for French, Spanish, Swahili and Somali. English users see zero change.</w:t>
+      </w:r>
+    </w:p>
+    <w:p>
+      <w:pPr>
+        <w:pStyle w:val="Heading2"/>
+      </w:pPr>
+      <w:r>
         <w:t xml:space="preserve">How this was verified</w:t>
       </w:r>
     </w:p>
@@ -225,7 +250,7 @@
           <w:sz w:val="22"/>
           <w:szCs w:val="22"/>
         </w:rPr>
-        <w:t xml:space="preserve">Full regression gate (98 automated checks) passed before each of the three deployments.</w:t>
+        <w:t xml:space="preserve">Full regression gate (98 automated checks) passed before each of the four deployments.</w:t>
       </w:r>
     </w:p>
     <w:p>
@@ -259,7 +284,41 @@
           <w:sz w:val="22"/>
           <w:szCs w:val="22"/>
         </w:rPr>
+        <w:t xml:space="preserve">The Arabic shell was checked item by item — all nine sidebar entries render Arabic with zero English leftovers; the English shell is unchanged.</w:t>
+      </w:r>
+    </w:p>
+    <w:p>
+      <w:pPr>
+        <w:pStyle w:val="ListParagraph"/>
+        <w:numPr>
+          <w:ilvl w:val="0"/>
+          <w:numId w:val="2"/>
+        </w:numPr>
+        <w:spacing w:after="80"/>
+      </w:pPr>
+      <w:r>
+        <w:rPr>
+          <w:sz w:val="22"/>
+          <w:szCs w:val="22"/>
+        </w:rPr>
         <w:t xml:space="preserve">The English console was re-checked after each deploy and is unchanged — which is why the UAT and QA scripts are safe.</w:t>
+      </w:r>
+    </w:p>
+    <w:p>
+      <w:pPr>
+        <w:pStyle w:val="ListParagraph"/>
+        <w:numPr>
+          <w:ilvl w:val="0"/>
+          <w:numId w:val="2"/>
+        </w:numPr>
+        <w:spacing w:after="80"/>
+      </w:pPr>
+      <w:r>
+        <w:rPr>
+          <w:sz w:val="22"/>
+          <w:szCs w:val="22"/>
+        </w:rPr>
+        <w:t xml:space="preserve">Independently confirmed by the QA team against live production (their own regression run, 25 live mutating test cases, and a real receipt upload traced end-to-end through the audit chain).</w:t>
       </w:r>
     </w:p>
     <w:p>
@@ -1076,7 +1135,7 @@
                 <w:sz w:val="21"/>
                 <w:szCs w:val="21"/>
               </w:rPr>
-              <w:t xml:space="preserve">Delete the UAT-prefixed fixtures (round, partner, grievances), disable the shared uat.donor account, and decide whether the OB "hide test data" toggle defaults on.</w:t>
+              <w:t xml:space="preserve">Delete the UAT-prefixed fixtures (rounds 11–12, partner 87, disbursements 28–29, intervention 7, grievances 12–13, plus the original UAT round/partner set), disable the shared uat.donor account, and decide whether the OB "hide test data" toggle defaults on.</w:t>
             </w:r>
           </w:p>
         </w:tc>

</xml_diff>